<commit_message>
Update the demo and docs for Blog v3
AWS asked for approved fictional names and official AWS icons and images no
wider than 800 pixels. Shield the model now covers the agent's model calls
too so the docs say so.

1. The sample case note and the demo docs use Mateo Jackson and AnyCompany
   Electronics and 555-0100. The example tokens are the ones the live
   gateway mints for those values.
2. docs/diagrams holds the blog's reference architecture and one sequence
   diagram for each mode. build.py draws them from the AWS icon package and
   render.mjs exports each at 800 pixels wide.
3. The README covers model calls and has a section for readers who want the
   interceptor on a gateway they already run.
4. SHIELD-THE-MODEL.md records that shield the model is deployed.

Co-Authored-By: Claude Opus 5.5 <noreply@anthropic.com>
</commit_message>
<xml_diff>
--- a/samples/dispute-case-note.docx
+++ b/samples/dispute-case-note.docx
@@ -14,17 +14,17 @@
     </w:p>
     <w:p>
       <w:r>
-        <w:t xml:space="preserve">Customer: Daniel Okonkwo</w:t>
+        <w:t xml:space="preserve">Customer: Mateo Jackson</w:t>
       </w:r>
     </w:p>
     <w:p>
       <w:r>
-        <w:t xml:space="preserve">Email: daniel.okonkwo@example.com</w:t>
+        <w:t xml:space="preserve">Email: mateo_jackson@example.com</w:t>
       </w:r>
     </w:p>
     <w:p>
       <w:r>
-        <w:t xml:space="preserve">Phone: 555-0133</w:t>
+        <w:t xml:space="preserve">Phone: 555-0100</w:t>
       </w:r>
     </w:p>
     <w:p>
@@ -34,7 +34,7 @@
     </w:p>
     <w:p>
       <w:r>
-        <w:t xml:space="preserve">Merchant: ACME Electronics, London</w:t>
+        <w:t xml:space="preserve">Merchant: AnyCompany Electronics, London</w:t>
       </w:r>
     </w:p>
     <w:p>

</xml_diff>